<commit_message>
Implemented bonus MYSQL database.
</commit_message>
<xml_diff>
--- a/docs/project_document_final.docx
+++ b/docs/project_document_final.docx
@@ -66,7 +66,7 @@
         </w:rPr>
         <w:t xml:space="preserve">Repository: </w:t>
       </w:r>
-      <w:hyperlink w:history="1" r:id="rIdrwloefvvkjlp8b2bzhgjc">
+      <w:hyperlink w:history="1" r:id="rId2idxstk5dpxdynxx-rgf4">
         <w:r>
           <w:rPr>
             <w:rStyle w:val="Hyperlink"/>
@@ -3124,7 +3124,7 @@
         <w:t xml:space="preserve">Quality assurance:</w:t>
       </w:r>
       <w:r>
-        <w:t xml:space="preserve"> 37 automated tests check that every page renders, that the filters work, that country colours stay fixed, that the processed data are complete, and that the published findings match the data.</w:t>
+        <w:t xml:space="preserve"> 41 automated tests check that every page renders, that the filters work, that country colours stay fixed, that the processed data are complete, that the published findings match the data, and that the database load script matches the data.</w:t>
       </w:r>
     </w:p>
     <w:p>
@@ -3931,7 +3931,7 @@
       <w:r>
         <w:drawing>
           <wp:inline distT="0" distB="0" distL="0" distR="0">
-            <wp:extent cx="5715000" cy="4819650"/>
+            <wp:extent cx="4286250" cy="3619500"/>
             <wp:effectExtent t="0" r="0" b="0" l="0"/>
             <wp:docPr id="3" name="02_economic_growth.png" descr="Figure 3. Economic Growth page: KPI cards, GDP growth by country, key insights, and comparisons with each country's normal." title="Figure 3. Economic Growth page: KPI cards, GDP growth by country, key insights, and comparisons with each country's normal."/>
             <wp:cNvGraphicFramePr>
@@ -3956,7 +3956,7 @@
                   <pic:spPr bwMode="auto">
                     <a:xfrm>
                       <a:off x="0" y="0"/>
-                      <a:ext cx="5715000" cy="4819650"/>
+                      <a:ext cx="4286250" cy="3619500"/>
                     </a:xfrm>
                     <a:prstGeom prst="rect">
                       <a:avLst/>
@@ -3994,7 +3994,7 @@
       <w:r>
         <w:drawing>
           <wp:inline distT="0" distB="0" distL="0" distR="0">
-            <wp:extent cx="5715000" cy="4819650"/>
+            <wp:extent cx="4286250" cy="3619500"/>
             <wp:effectExtent t="0" r="0" b="0" l="0"/>
             <wp:docPr id="4" name="03_labour_market.png" descr="Figure 4. Labour Market page." title="Figure 4. Labour Market page."/>
             <wp:cNvGraphicFramePr>
@@ -4019,7 +4019,7 @@
                   <pic:spPr bwMode="auto">
                     <a:xfrm>
                       <a:off x="0" y="0"/>
-                      <a:ext cx="5715000" cy="4819650"/>
+                      <a:ext cx="4286250" cy="3619500"/>
                     </a:xfrm>
                     <a:prstGeom prst="rect">
                       <a:avLst/>
@@ -4057,7 +4057,7 @@
       <w:r>
         <w:drawing>
           <wp:inline distT="0" distB="0" distL="0" distR="0">
-            <wp:extent cx="5715000" cy="4819650"/>
+            <wp:extent cx="4286250" cy="3619500"/>
             <wp:effectExtent t="0" r="0" b="0" l="0"/>
             <wp:docPr id="5" name="04_pandemic_policy.png" descr="Figure 5. Pandemic &amp; Policy Response page: reported cases per million on a log scale." title="Figure 5. Pandemic &amp; Policy Response page: reported cases per million on a log scale."/>
             <wp:cNvGraphicFramePr>
@@ -4082,7 +4082,7 @@
                   <pic:spPr bwMode="auto">
                     <a:xfrm>
                       <a:off x="0" y="0"/>
-                      <a:ext cx="5715000" cy="4819650"/>
+                      <a:ext cx="4286250" cy="3619500"/>
                     </a:xfrm>
                     <a:prstGeom prst="rect">
                       <a:avLst/>
@@ -4120,7 +4120,7 @@
       <w:r>
         <w:drawing>
           <wp:inline distT="0" distB="0" distL="0" distR="0">
-            <wp:extent cx="5715000" cy="4819650"/>
+            <wp:extent cx="4286250" cy="3619500"/>
             <wp:effectExtent t="0" r="0" b="0" l="0"/>
             <wp:docPr id="6" name="05_country_comparisons.png" descr="Figure 6. Country Comparisons page: ranking on a chosen indicator and year." title="Figure 6. Country Comparisons page: ranking on a chosen indicator and year."/>
             <wp:cNvGraphicFramePr>
@@ -4145,7 +4145,7 @@
                   <pic:spPr bwMode="auto">
                     <a:xfrm>
                       <a:off x="0" y="0"/>
-                      <a:ext cx="5715000" cy="4819650"/>
+                      <a:ext cx="4286250" cy="3619500"/>
                     </a:xfrm>
                     <a:prstGeom prst="rect">
                       <a:avLst/>
@@ -4183,7 +4183,7 @@
       <w:r>
         <w:drawing>
           <wp:inline distT="0" distB="0" distL="0" distR="0">
-            <wp:extent cx="5715000" cy="4819650"/>
+            <wp:extent cx="4286250" cy="3619500"/>
             <wp:effectExtent t="0" r="0" b="0" l="0"/>
             <wp:docPr id="7" name="06_key_findings.png" descr="Figure 7. Key Findings page: headline results calculated live from the data." title="Figure 7. Key Findings page: headline results calculated live from the data."/>
             <wp:cNvGraphicFramePr>
@@ -4208,7 +4208,7 @@
                   <pic:spPr bwMode="auto">
                     <a:xfrm>
                       <a:off x="0" y="0"/>
-                      <a:ext cx="5715000" cy="4819650"/>
+                      <a:ext cx="4286250" cy="3619500"/>
                     </a:xfrm>
                     <a:prstGeom prst="rect">
                       <a:avLst/>
@@ -4735,7 +4735,7 @@
         <w:t xml:space="preserve">Tests: </w:t>
       </w:r>
       <w:r>
-        <w:t xml:space="preserve">python -m unittest discover -s tests (37 tests).</w:t>
+        <w:t xml:space="preserve">python -m unittest discover -s tests (41 tests).</w:t>
       </w:r>
     </w:p>
     <w:p>
@@ -4783,7 +4783,7 @@
         <w:t xml:space="preserve">MySQL database (bonus challenge):</w:t>
       </w:r>
       <w:r>
-        <w:t xml:space="preserve"> not implemented. It is optional in the brief; the dashboard reads the processed CSV files directly.</w:t>
+        <w:t xml:space="preserve"> implemented; see section 16. The dashboard itself does not need MySQL.</w:t>
       </w:r>
     </w:p>
     <w:p>
@@ -4804,6 +4804,820 @@
       </w:r>
       <w:r>
         <w:t xml:space="preserve"> considered at the planning stage; not included.</w:t>
+      </w:r>
+    </w:p>
+    <w:p>
+      <w:r>
+        <w:br w:type="page"/>
+      </w:r>
+    </w:p>
+    <w:p>
+      <w:pPr>
+        <w:pStyle w:val="Heading1"/>
+      </w:pPr>
+      <w:r>
+        <w:t xml:space="preserve">16. Bonus Challenge: MySQL Relational Database</w:t>
+      </w:r>
+    </w:p>
+    <w:p>
+      <w:pPr>
+        <w:spacing w:after="120"/>
+      </w:pPr>
+      <w:r>
+        <w:t xml:space="preserve">The brief's optional bonus asks for a MySQL database hosting the study's datasets. The database (folder database/ in the repository) is built from the same processed CSV files the dashboard reads, so there is no second data pipeline.</w:t>
+      </w:r>
+    </w:p>
+    <w:p>
+      <w:pPr>
+        <w:pStyle w:val="Heading3"/>
+      </w:pPr>
+      <w:r>
+        <w:t xml:space="preserve">Architecture and justification</w:t>
+      </w:r>
+    </w:p>
+    <w:p>
+      <w:pPr>
+        <w:pStyle w:val="ListParagraph"/>
+        <w:numPr>
+          <w:ilvl w:val="0"/>
+          <w:numId w:val="2"/>
+        </w:numPr>
+        <w:spacing w:after="60"/>
+      </w:pPr>
+      <w:r>
+        <w:rPr>
+          <w:b/>
+          <w:bCs/>
+        </w:rPr>
+        <w:t xml:space="preserve">Each fact is stored once.</w:t>
+      </w:r>
+      <w:r>
+        <w:t xml:space="preserve"> The merged CSV files repeat every annual value in 12 monthly rows; the database stores it once and rebuilds the merged tables with views (third normal form).</w:t>
+      </w:r>
+    </w:p>
+    <w:p>
+      <w:pPr>
+        <w:pStyle w:val="ListParagraph"/>
+        <w:numPr>
+          <w:ilvl w:val="0"/>
+          <w:numId w:val="2"/>
+        </w:numPr>
+        <w:spacing w:after="60"/>
+      </w:pPr>
+      <w:r>
+        <w:rPr>
+          <w:b/>
+          <w:bCs/>
+        </w:rPr>
+        <w:t xml:space="preserve">Long format:</w:t>
+      </w:r>
+      <w:r>
+        <w:t xml:space="preserve"> one row per country, indicator, and period, so adding an indicator adds rows, not columns.</w:t>
+      </w:r>
+    </w:p>
+    <w:p>
+      <w:pPr>
+        <w:pStyle w:val="ListParagraph"/>
+        <w:numPr>
+          <w:ilvl w:val="0"/>
+          <w:numId w:val="2"/>
+        </w:numPr>
+        <w:spacing w:after="60"/>
+      </w:pPr>
+      <w:r>
+        <w:rPr>
+          <w:b/>
+          <w:bCs/>
+        </w:rPr>
+        <w:t xml:space="preserve">Two observation tables by time grain:</w:t>
+      </w:r>
+      <w:r>
+        <w:t xml:space="preserve"> annual World Bank data (key: year) and monthly pandemic data (key: month), each with a simple, correctly typed key.</w:t>
+      </w:r>
+    </w:p>
+    <w:p>
+      <w:pPr>
+        <w:pStyle w:val="ListParagraph"/>
+        <w:numPr>
+          <w:ilvl w:val="0"/>
+          <w:numId w:val="2"/>
+        </w:numPr>
+        <w:spacing w:after="60"/>
+      </w:pPr>
+      <w:r>
+        <w:rPr>
+          <w:b/>
+          <w:bCs/>
+        </w:rPr>
+        <w:t xml:space="preserve">Derived data as views:</w:t>
+      </w:r>
+      <w:r>
+        <w:t xml:space="preserve"> baselines, yearly pandemic totals, and the merged dashboard table are calculated from the observations and cannot drift out of date.</w:t>
+      </w:r>
+    </w:p>
+    <w:p>
+      <w:pPr>
+        <w:pStyle w:val="ListParagraph"/>
+        <w:numPr>
+          <w:ilvl w:val="0"/>
+          <w:numId w:val="2"/>
+        </w:numPr>
+        <w:spacing w:after="60"/>
+      </w:pPr>
+      <w:r>
+        <w:rPr>
+          <w:b/>
+          <w:bCs/>
+        </w:rPr>
+        <w:t xml:space="preserve">Missing means missing:</w:t>
+      </w:r>
+      <w:r>
+        <w:t xml:space="preserve"> a missing value is an absent row, never zero.</w:t>
+      </w:r>
+    </w:p>
+    <w:p>
+      <w:pPr>
+        <w:keepNext/>
+        <w:spacing w:after="60" w:before="120"/>
+        <w:jc w:val="center"/>
+      </w:pPr>
+      <w:r>
+        <w:drawing>
+          <wp:inline distT="0" distB="0" distL="0" distR="0">
+            <wp:extent cx="5715000" cy="3390900"/>
+            <wp:effectExtent t="0" r="0" b="0" l="0"/>
+            <wp:docPr id="8" name="07_er_diagram.png" descr="Figure 8. Entity-relationship diagram of the covid_economy database." title="Figure 8. Entity-relationship diagram of the covid_economy database."/>
+            <wp:cNvGraphicFramePr>
+              <a:graphicFrameLocks xmlns:a="http://schemas.openxmlformats.org/drawingml/2006/main" noChangeAspect="1"/>
+            </wp:cNvGraphicFramePr>
+            <a:graphic xmlns:a="http://schemas.openxmlformats.org/drawingml/2006/main">
+              <a:graphicData uri="http://schemas.openxmlformats.org/drawingml/2006/picture">
+                <pic:pic xmlns:pic="http://schemas.openxmlformats.org/drawingml/2006/picture">
+                  <pic:nvPicPr>
+                    <pic:cNvPr id="0" name="" descr=""/>
+                    <pic:cNvPicPr>
+                      <a:picLocks noChangeAspect="1" noChangeArrowheads="1"/>
+                    </pic:cNvPicPr>
+                  </pic:nvPicPr>
+                  <pic:blipFill>
+                    <a:blip r:embed="rId15" cstate="none"/>
+                    <a:srcRect/>
+                    <a:stretch>
+                      <a:fillRect/>
+                    </a:stretch>
+                  </pic:blipFill>
+                  <pic:spPr bwMode="auto">
+                    <a:xfrm>
+                      <a:off x="0" y="0"/>
+                      <a:ext cx="5715000" cy="3390900"/>
+                    </a:xfrm>
+                    <a:prstGeom prst="rect">
+                      <a:avLst/>
+                    </a:prstGeom>
+                  </pic:spPr>
+                </pic:pic>
+              </a:graphicData>
+            </a:graphic>
+          </wp:inline>
+        </w:drawing>
+      </w:r>
+    </w:p>
+    <w:p>
+      <w:pPr>
+        <w:spacing w:after="240"/>
+        <w:jc w:val="center"/>
+      </w:pPr>
+      <w:r>
+        <w:rPr>
+          <w:i/>
+          <w:iCs/>
+          <w:color w:val="5B6475"/>
+          <w:sz w:val="18"/>
+          <w:szCs w:val="18"/>
+        </w:rPr>
+        <w:t xml:space="preserve">Figure 8. Entity-relationship diagram of the covid_economy database.</w:t>
+      </w:r>
+    </w:p>
+    <w:tbl>
+      <w:tblPr>
+        <w:tblW w:type="dxa" w:w="9026"/>
+        <w:tblBorders>
+          <w:top w:val="single" w:color="auto" w:sz="4"/>
+          <w:left w:val="single" w:color="auto" w:sz="4"/>
+          <w:bottom w:val="single" w:color="auto" w:sz="4"/>
+          <w:right w:val="single" w:color="auto" w:sz="4"/>
+          <w:insideH w:val="single" w:color="auto" w:sz="4"/>
+          <w:insideV w:val="single" w:color="auto" w:sz="4"/>
+        </w:tblBorders>
+      </w:tblPr>
+      <w:tblGrid>
+        <w:gridCol w:w="2200"/>
+        <w:gridCol w:w="2700"/>
+        <w:gridCol w:w="3226"/>
+        <w:gridCol w:w="900"/>
+      </w:tblGrid>
+      <w:tr>
+        <w:trPr>
+          <w:tblHeader/>
+        </w:trPr>
+        <w:tc>
+          <w:tcPr>
+            <w:tcW w:type="dxa" w:w="2200"/>
+            <w:tcBorders>
+              <w:top w:val="single" w:color="E8DCD4" w:sz="4"/>
+              <w:left w:val="single" w:color="E8DCD4" w:sz="4"/>
+              <w:bottom w:val="single" w:color="E8DCD4" w:sz="4"/>
+              <w:right w:val="single" w:color="E8DCD4" w:sz="4"/>
+            </w:tcBorders>
+            <w:shd w:fill="F5EAE5" w:color="auto" w:val="clear"/>
+            <w:tcMar>
+              <w:top w:type="dxa" w:w="80"/>
+              <w:left w:type="dxa" w:w="110"/>
+              <w:bottom w:type="dxa" w:w="80"/>
+              <w:right w:type="dxa" w:w="110"/>
+            </w:tcMar>
+          </w:tcPr>
+          <w:p>
+            <w:r>
+              <w:rPr>
+                <w:b/>
+                <w:bCs/>
+              </w:rPr>
+              <w:t xml:space="preserve">Table</w:t>
+            </w:r>
+          </w:p>
+        </w:tc>
+        <w:tc>
+          <w:tcPr>
+            <w:tcW w:type="dxa" w:w="2700"/>
+            <w:tcBorders>
+              <w:top w:val="single" w:color="E8DCD4" w:sz="4"/>
+              <w:left w:val="single" w:color="E8DCD4" w:sz="4"/>
+              <w:bottom w:val="single" w:color="E8DCD4" w:sz="4"/>
+              <w:right w:val="single" w:color="E8DCD4" w:sz="4"/>
+            </w:tcBorders>
+            <w:shd w:fill="F5EAE5" w:color="auto" w:val="clear"/>
+            <w:tcMar>
+              <w:top w:type="dxa" w:w="80"/>
+              <w:left w:type="dxa" w:w="110"/>
+              <w:bottom w:type="dxa" w:w="80"/>
+              <w:right w:type="dxa" w:w="110"/>
+            </w:tcMar>
+          </w:tcPr>
+          <w:p>
+            <w:r>
+              <w:rPr>
+                <w:b/>
+                <w:bCs/>
+              </w:rPr>
+              <w:t xml:space="preserve">Primary key</w:t>
+            </w:r>
+          </w:p>
+        </w:tc>
+        <w:tc>
+          <w:tcPr>
+            <w:tcW w:type="dxa" w:w="3226"/>
+            <w:tcBorders>
+              <w:top w:val="single" w:color="E8DCD4" w:sz="4"/>
+              <w:left w:val="single" w:color="E8DCD4" w:sz="4"/>
+              <w:bottom w:val="single" w:color="E8DCD4" w:sz="4"/>
+              <w:right w:val="single" w:color="E8DCD4" w:sz="4"/>
+            </w:tcBorders>
+            <w:shd w:fill="F5EAE5" w:color="auto" w:val="clear"/>
+            <w:tcMar>
+              <w:top w:type="dxa" w:w="80"/>
+              <w:left w:type="dxa" w:w="110"/>
+              <w:bottom w:type="dxa" w:w="80"/>
+              <w:right w:type="dxa" w:w="110"/>
+            </w:tcMar>
+          </w:tcPr>
+          <w:p>
+            <w:r>
+              <w:rPr>
+                <w:b/>
+                <w:bCs/>
+              </w:rPr>
+              <w:t xml:space="preserve">Foreign keys</w:t>
+            </w:r>
+          </w:p>
+        </w:tc>
+        <w:tc>
+          <w:tcPr>
+            <w:tcW w:type="dxa" w:w="900"/>
+            <w:tcBorders>
+              <w:top w:val="single" w:color="E8DCD4" w:sz="4"/>
+              <w:left w:val="single" w:color="E8DCD4" w:sz="4"/>
+              <w:bottom w:val="single" w:color="E8DCD4" w:sz="4"/>
+              <w:right w:val="single" w:color="E8DCD4" w:sz="4"/>
+            </w:tcBorders>
+            <w:shd w:fill="F5EAE5" w:color="auto" w:val="clear"/>
+            <w:tcMar>
+              <w:top w:type="dxa" w:w="80"/>
+              <w:left w:type="dxa" w:w="110"/>
+              <w:bottom w:type="dxa" w:w="80"/>
+              <w:right w:type="dxa" w:w="110"/>
+            </w:tcMar>
+          </w:tcPr>
+          <w:p>
+            <w:r>
+              <w:rPr>
+                <w:b/>
+                <w:bCs/>
+              </w:rPr>
+              <w:t xml:space="preserve">Rows</w:t>
+            </w:r>
+          </w:p>
+        </w:tc>
+      </w:tr>
+      <w:tr>
+        <w:tc>
+          <w:tcPr>
+            <w:tcW w:type="dxa" w:w="2200"/>
+            <w:tcBorders>
+              <w:top w:val="single" w:color="E8DCD4" w:sz="4"/>
+              <w:left w:val="single" w:color="E8DCD4" w:sz="4"/>
+              <w:bottom w:val="single" w:color="E8DCD4" w:sz="4"/>
+              <w:right w:val="single" w:color="E8DCD4" w:sz="4"/>
+            </w:tcBorders>
+            <w:tcMar>
+              <w:top w:type="dxa" w:w="80"/>
+              <w:left w:type="dxa" w:w="110"/>
+              <w:bottom w:type="dxa" w:w="80"/>
+              <w:right w:type="dxa" w:w="110"/>
+            </w:tcMar>
+          </w:tcPr>
+          <w:p>
+            <w:r>
+              <w:t xml:space="preserve">data_source</w:t>
+            </w:r>
+          </w:p>
+        </w:tc>
+        <w:tc>
+          <w:tcPr>
+            <w:tcW w:type="dxa" w:w="2700"/>
+            <w:tcBorders>
+              <w:top w:val="single" w:color="E8DCD4" w:sz="4"/>
+              <w:left w:val="single" w:color="E8DCD4" w:sz="4"/>
+              <w:bottom w:val="single" w:color="E8DCD4" w:sz="4"/>
+              <w:right w:val="single" w:color="E8DCD4" w:sz="4"/>
+            </w:tcBorders>
+            <w:tcMar>
+              <w:top w:type="dxa" w:w="80"/>
+              <w:left w:type="dxa" w:w="110"/>
+              <w:bottom w:type="dxa" w:w="80"/>
+              <w:right w:type="dxa" w:w="110"/>
+            </w:tcMar>
+          </w:tcPr>
+          <w:p>
+            <w:r>
+              <w:t xml:space="preserve">source_id</w:t>
+            </w:r>
+          </w:p>
+        </w:tc>
+        <w:tc>
+          <w:tcPr>
+            <w:tcW w:type="dxa" w:w="3226"/>
+            <w:tcBorders>
+              <w:top w:val="single" w:color="E8DCD4" w:sz="4"/>
+              <w:left w:val="single" w:color="E8DCD4" w:sz="4"/>
+              <w:bottom w:val="single" w:color="E8DCD4" w:sz="4"/>
+              <w:right w:val="single" w:color="E8DCD4" w:sz="4"/>
+            </w:tcBorders>
+            <w:tcMar>
+              <w:top w:type="dxa" w:w="80"/>
+              <w:left w:type="dxa" w:w="110"/>
+              <w:bottom w:type="dxa" w:w="80"/>
+              <w:right w:type="dxa" w:w="110"/>
+            </w:tcMar>
+          </w:tcPr>
+          <w:p>
+            <w:r>
+              <w:t xml:space="preserve">—</w:t>
+            </w:r>
+          </w:p>
+        </w:tc>
+        <w:tc>
+          <w:tcPr>
+            <w:tcW w:type="dxa" w:w="900"/>
+            <w:tcBorders>
+              <w:top w:val="single" w:color="E8DCD4" w:sz="4"/>
+              <w:left w:val="single" w:color="E8DCD4" w:sz="4"/>
+              <w:bottom w:val="single" w:color="E8DCD4" w:sz="4"/>
+              <w:right w:val="single" w:color="E8DCD4" w:sz="4"/>
+            </w:tcBorders>
+            <w:tcMar>
+              <w:top w:type="dxa" w:w="80"/>
+              <w:left w:type="dxa" w:w="110"/>
+              <w:bottom w:type="dxa" w:w="80"/>
+              <w:right w:type="dxa" w:w="110"/>
+            </w:tcMar>
+          </w:tcPr>
+          <w:p>
+            <w:r>
+              <w:t xml:space="preserve">3</w:t>
+            </w:r>
+          </w:p>
+        </w:tc>
+      </w:tr>
+      <w:tr>
+        <w:tc>
+          <w:tcPr>
+            <w:tcW w:type="dxa" w:w="2200"/>
+            <w:tcBorders>
+              <w:top w:val="single" w:color="E8DCD4" w:sz="4"/>
+              <w:left w:val="single" w:color="E8DCD4" w:sz="4"/>
+              <w:bottom w:val="single" w:color="E8DCD4" w:sz="4"/>
+              <w:right w:val="single" w:color="E8DCD4" w:sz="4"/>
+            </w:tcBorders>
+            <w:tcMar>
+              <w:top w:type="dxa" w:w="80"/>
+              <w:left w:type="dxa" w:w="110"/>
+              <w:bottom w:type="dxa" w:w="80"/>
+              <w:right w:type="dxa" w:w="110"/>
+            </w:tcMar>
+          </w:tcPr>
+          <w:p>
+            <w:r>
+              <w:t xml:space="preserve">country</w:t>
+            </w:r>
+          </w:p>
+        </w:tc>
+        <w:tc>
+          <w:tcPr>
+            <w:tcW w:type="dxa" w:w="2700"/>
+            <w:tcBorders>
+              <w:top w:val="single" w:color="E8DCD4" w:sz="4"/>
+              <w:left w:val="single" w:color="E8DCD4" w:sz="4"/>
+              <w:bottom w:val="single" w:color="E8DCD4" w:sz="4"/>
+              <w:right w:val="single" w:color="E8DCD4" w:sz="4"/>
+            </w:tcBorders>
+            <w:tcMar>
+              <w:top w:type="dxa" w:w="80"/>
+              <w:left w:type="dxa" w:w="110"/>
+              <w:bottom w:type="dxa" w:w="80"/>
+              <w:right w:type="dxa" w:w="110"/>
+            </w:tcMar>
+          </w:tcPr>
+          <w:p>
+            <w:r>
+              <w:t xml:space="preserve">country_code (ISO-3)</w:t>
+            </w:r>
+          </w:p>
+        </w:tc>
+        <w:tc>
+          <w:tcPr>
+            <w:tcW w:type="dxa" w:w="3226"/>
+            <w:tcBorders>
+              <w:top w:val="single" w:color="E8DCD4" w:sz="4"/>
+              <w:left w:val="single" w:color="E8DCD4" w:sz="4"/>
+              <w:bottom w:val="single" w:color="E8DCD4" w:sz="4"/>
+              <w:right w:val="single" w:color="E8DCD4" w:sz="4"/>
+            </w:tcBorders>
+            <w:tcMar>
+              <w:top w:type="dxa" w:w="80"/>
+              <w:left w:type="dxa" w:w="110"/>
+              <w:bottom w:type="dxa" w:w="80"/>
+              <w:right w:type="dxa" w:w="110"/>
+            </w:tcMar>
+          </w:tcPr>
+          <w:p>
+            <w:r>
+              <w:t xml:space="preserve">—</w:t>
+            </w:r>
+          </w:p>
+        </w:tc>
+        <w:tc>
+          <w:tcPr>
+            <w:tcW w:type="dxa" w:w="900"/>
+            <w:tcBorders>
+              <w:top w:val="single" w:color="E8DCD4" w:sz="4"/>
+              <w:left w:val="single" w:color="E8DCD4" w:sz="4"/>
+              <w:bottom w:val="single" w:color="E8DCD4" w:sz="4"/>
+              <w:right w:val="single" w:color="E8DCD4" w:sz="4"/>
+            </w:tcBorders>
+            <w:tcMar>
+              <w:top w:type="dxa" w:w="80"/>
+              <w:left w:type="dxa" w:w="110"/>
+              <w:bottom w:type="dxa" w:w="80"/>
+              <w:right w:type="dxa" w:w="110"/>
+            </w:tcMar>
+          </w:tcPr>
+          <w:p>
+            <w:r>
+              <w:t xml:space="preserve">7</w:t>
+            </w:r>
+          </w:p>
+        </w:tc>
+      </w:tr>
+      <w:tr>
+        <w:tc>
+          <w:tcPr>
+            <w:tcW w:type="dxa" w:w="2200"/>
+            <w:tcBorders>
+              <w:top w:val="single" w:color="E8DCD4" w:sz="4"/>
+              <w:left w:val="single" w:color="E8DCD4" w:sz="4"/>
+              <w:bottom w:val="single" w:color="E8DCD4" w:sz="4"/>
+              <w:right w:val="single" w:color="E8DCD4" w:sz="4"/>
+            </w:tcBorders>
+            <w:tcMar>
+              <w:top w:type="dxa" w:w="80"/>
+              <w:left w:type="dxa" w:w="110"/>
+              <w:bottom w:type="dxa" w:w="80"/>
+              <w:right w:type="dxa" w:w="110"/>
+            </w:tcMar>
+          </w:tcPr>
+          <w:p>
+            <w:r>
+              <w:t xml:space="preserve">indicator</w:t>
+            </w:r>
+          </w:p>
+        </w:tc>
+        <w:tc>
+          <w:tcPr>
+            <w:tcW w:type="dxa" w:w="2700"/>
+            <w:tcBorders>
+              <w:top w:val="single" w:color="E8DCD4" w:sz="4"/>
+              <w:left w:val="single" w:color="E8DCD4" w:sz="4"/>
+              <w:bottom w:val="single" w:color="E8DCD4" w:sz="4"/>
+              <w:right w:val="single" w:color="E8DCD4" w:sz="4"/>
+            </w:tcBorders>
+            <w:tcMar>
+              <w:top w:type="dxa" w:w="80"/>
+              <w:left w:type="dxa" w:w="110"/>
+              <w:bottom w:type="dxa" w:w="80"/>
+              <w:right w:type="dxa" w:w="110"/>
+            </w:tcMar>
+          </w:tcPr>
+          <w:p>
+            <w:r>
+              <w:t xml:space="preserve">indicator_code</w:t>
+            </w:r>
+          </w:p>
+        </w:tc>
+        <w:tc>
+          <w:tcPr>
+            <w:tcW w:type="dxa" w:w="3226"/>
+            <w:tcBorders>
+              <w:top w:val="single" w:color="E8DCD4" w:sz="4"/>
+              <w:left w:val="single" w:color="E8DCD4" w:sz="4"/>
+              <w:bottom w:val="single" w:color="E8DCD4" w:sz="4"/>
+              <w:right w:val="single" w:color="E8DCD4" w:sz="4"/>
+            </w:tcBorders>
+            <w:tcMar>
+              <w:top w:type="dxa" w:w="80"/>
+              <w:left w:type="dxa" w:w="110"/>
+              <w:bottom w:type="dxa" w:w="80"/>
+              <w:right w:type="dxa" w:w="110"/>
+            </w:tcMar>
+          </w:tcPr>
+          <w:p>
+            <w:r>
+              <w:t xml:space="preserve">source_id → data_source</w:t>
+            </w:r>
+          </w:p>
+        </w:tc>
+        <w:tc>
+          <w:tcPr>
+            <w:tcW w:type="dxa" w:w="900"/>
+            <w:tcBorders>
+              <w:top w:val="single" w:color="E8DCD4" w:sz="4"/>
+              <w:left w:val="single" w:color="E8DCD4" w:sz="4"/>
+              <w:bottom w:val="single" w:color="E8DCD4" w:sz="4"/>
+              <w:right w:val="single" w:color="E8DCD4" w:sz="4"/>
+            </w:tcBorders>
+            <w:tcMar>
+              <w:top w:type="dxa" w:w="80"/>
+              <w:left w:type="dxa" w:w="110"/>
+              <w:bottom w:type="dxa" w:w="80"/>
+              <w:right w:type="dxa" w:w="110"/>
+            </w:tcMar>
+          </w:tcPr>
+          <w:p>
+            <w:r>
+              <w:t xml:space="preserve">8</w:t>
+            </w:r>
+          </w:p>
+        </w:tc>
+      </w:tr>
+      <w:tr>
+        <w:tc>
+          <w:tcPr>
+            <w:tcW w:type="dxa" w:w="2200"/>
+            <w:tcBorders>
+              <w:top w:val="single" w:color="E8DCD4" w:sz="4"/>
+              <w:left w:val="single" w:color="E8DCD4" w:sz="4"/>
+              <w:bottom w:val="single" w:color="E8DCD4" w:sz="4"/>
+              <w:right w:val="single" w:color="E8DCD4" w:sz="4"/>
+            </w:tcBorders>
+            <w:tcMar>
+              <w:top w:type="dxa" w:w="80"/>
+              <w:left w:type="dxa" w:w="110"/>
+              <w:bottom w:type="dxa" w:w="80"/>
+              <w:right w:type="dxa" w:w="110"/>
+            </w:tcMar>
+          </w:tcPr>
+          <w:p>
+            <w:r>
+              <w:t xml:space="preserve">annual_observation</w:t>
+            </w:r>
+          </w:p>
+        </w:tc>
+        <w:tc>
+          <w:tcPr>
+            <w:tcW w:type="dxa" w:w="2700"/>
+            <w:tcBorders>
+              <w:top w:val="single" w:color="E8DCD4" w:sz="4"/>
+              <w:left w:val="single" w:color="E8DCD4" w:sz="4"/>
+              <w:bottom w:val="single" w:color="E8DCD4" w:sz="4"/>
+              <w:right w:val="single" w:color="E8DCD4" w:sz="4"/>
+            </w:tcBorders>
+            <w:tcMar>
+              <w:top w:type="dxa" w:w="80"/>
+              <w:left w:type="dxa" w:w="110"/>
+              <w:bottom w:type="dxa" w:w="80"/>
+              <w:right w:type="dxa" w:w="110"/>
+            </w:tcMar>
+          </w:tcPr>
+          <w:p>
+            <w:r>
+              <w:t xml:space="preserve">country_code, indicator_code, year</w:t>
+            </w:r>
+          </w:p>
+        </w:tc>
+        <w:tc>
+          <w:tcPr>
+            <w:tcW w:type="dxa" w:w="3226"/>
+            <w:tcBorders>
+              <w:top w:val="single" w:color="E8DCD4" w:sz="4"/>
+              <w:left w:val="single" w:color="E8DCD4" w:sz="4"/>
+              <w:bottom w:val="single" w:color="E8DCD4" w:sz="4"/>
+              <w:right w:val="single" w:color="E8DCD4" w:sz="4"/>
+            </w:tcBorders>
+            <w:tcMar>
+              <w:top w:type="dxa" w:w="80"/>
+              <w:left w:type="dxa" w:w="110"/>
+              <w:bottom w:type="dxa" w:w="80"/>
+              <w:right w:type="dxa" w:w="110"/>
+            </w:tcMar>
+          </w:tcPr>
+          <w:p>
+            <w:r>
+              <w:t xml:space="preserve">country_code → country; indicator_code → indicator</w:t>
+            </w:r>
+          </w:p>
+        </w:tc>
+        <w:tc>
+          <w:tcPr>
+            <w:tcW w:type="dxa" w:w="900"/>
+            <w:tcBorders>
+              <w:top w:val="single" w:color="E8DCD4" w:sz="4"/>
+              <w:left w:val="single" w:color="E8DCD4" w:sz="4"/>
+              <w:bottom w:val="single" w:color="E8DCD4" w:sz="4"/>
+              <w:right w:val="single" w:color="E8DCD4" w:sz="4"/>
+            </w:tcBorders>
+            <w:tcMar>
+              <w:top w:type="dxa" w:w="80"/>
+              <w:left w:type="dxa" w:w="110"/>
+              <w:bottom w:type="dxa" w:w="80"/>
+              <w:right w:type="dxa" w:w="110"/>
+            </w:tcMar>
+          </w:tcPr>
+          <w:p>
+            <w:r>
+              <w:t xml:space="preserve">147</w:t>
+            </w:r>
+          </w:p>
+        </w:tc>
+      </w:tr>
+      <w:tr>
+        <w:tc>
+          <w:tcPr>
+            <w:tcW w:type="dxa" w:w="2200"/>
+            <w:tcBorders>
+              <w:top w:val="single" w:color="E8DCD4" w:sz="4"/>
+              <w:left w:val="single" w:color="E8DCD4" w:sz="4"/>
+              <w:bottom w:val="single" w:color="E8DCD4" w:sz="4"/>
+              <w:right w:val="single" w:color="E8DCD4" w:sz="4"/>
+            </w:tcBorders>
+            <w:tcMar>
+              <w:top w:type="dxa" w:w="80"/>
+              <w:left w:type="dxa" w:w="110"/>
+              <w:bottom w:type="dxa" w:w="80"/>
+              <w:right w:type="dxa" w:w="110"/>
+            </w:tcMar>
+          </w:tcPr>
+          <w:p>
+            <w:r>
+              <w:t xml:space="preserve">monthly_observation</w:t>
+            </w:r>
+          </w:p>
+        </w:tc>
+        <w:tc>
+          <w:tcPr>
+            <w:tcW w:type="dxa" w:w="2700"/>
+            <w:tcBorders>
+              <w:top w:val="single" w:color="E8DCD4" w:sz="4"/>
+              <w:left w:val="single" w:color="E8DCD4" w:sz="4"/>
+              <w:bottom w:val="single" w:color="E8DCD4" w:sz="4"/>
+              <w:right w:val="single" w:color="E8DCD4" w:sz="4"/>
+            </w:tcBorders>
+            <w:tcMar>
+              <w:top w:type="dxa" w:w="80"/>
+              <w:left w:type="dxa" w:w="110"/>
+              <w:bottom w:type="dxa" w:w="80"/>
+              <w:right w:type="dxa" w:w="110"/>
+            </w:tcMar>
+          </w:tcPr>
+          <w:p>
+            <w:r>
+              <w:t xml:space="preserve">country_code, indicator_code, month_start</w:t>
+            </w:r>
+          </w:p>
+        </w:tc>
+        <w:tc>
+          <w:tcPr>
+            <w:tcW w:type="dxa" w:w="3226"/>
+            <w:tcBorders>
+              <w:top w:val="single" w:color="E8DCD4" w:sz="4"/>
+              <w:left w:val="single" w:color="E8DCD4" w:sz="4"/>
+              <w:bottom w:val="single" w:color="E8DCD4" w:sz="4"/>
+              <w:right w:val="single" w:color="E8DCD4" w:sz="4"/>
+            </w:tcBorders>
+            <w:tcMar>
+              <w:top w:type="dxa" w:w="80"/>
+              <w:left w:type="dxa" w:w="110"/>
+              <w:bottom w:type="dxa" w:w="80"/>
+              <w:right w:type="dxa" w:w="110"/>
+            </w:tcMar>
+          </w:tcPr>
+          <w:p>
+            <w:r>
+              <w:t xml:space="preserve">country_code → country; indicator_code → indicator</w:t>
+            </w:r>
+          </w:p>
+        </w:tc>
+        <w:tc>
+          <w:tcPr>
+            <w:tcW w:type="dxa" w:w="900"/>
+            <w:tcBorders>
+              <w:top w:val="single" w:color="E8DCD4" w:sz="4"/>
+              <w:left w:val="single" w:color="E8DCD4" w:sz="4"/>
+              <w:bottom w:val="single" w:color="E8DCD4" w:sz="4"/>
+              <w:right w:val="single" w:color="E8DCD4" w:sz="4"/>
+            </w:tcBorders>
+            <w:tcMar>
+              <w:top w:type="dxa" w:w="80"/>
+              <w:left w:type="dxa" w:w="110"/>
+              <w:bottom w:type="dxa" w:w="80"/>
+              <w:right w:type="dxa" w:w="110"/>
+            </w:tcMar>
+          </w:tcPr>
+          <w:p>
+            <w:r>
+              <w:t xml:space="preserve">1,685</w:t>
+            </w:r>
+          </w:p>
+        </w:tc>
+      </w:tr>
+    </w:tbl>
+    <w:p>
+      <w:pPr>
+        <w:spacing w:after="120"/>
+      </w:pPr>
+      <w:r>
+        <w:t xml:space="preserve">All relationships are one-to-many: a data source provides many indicators; each country and each indicator has many annual and monthly observations. Check constraints require valid years, month dates on the first day of the month, and a yearly aggregation rule (sum or mean) for monthly indicators only. Five views rebuild the annual table, the 2018–2019 baselines, the differences from them, the yearly pandemic values, and the merged by-year table.</w:t>
+      </w:r>
+    </w:p>
+    <w:p>
+      <w:pPr>
+        <w:pStyle w:val="Heading3"/>
+      </w:pPr>
+      <w:r>
+        <w:t xml:space="preserve">Verification</w:t>
+      </w:r>
+    </w:p>
+    <w:p>
+      <w:pPr>
+        <w:spacing w:after="120"/>
+      </w:pPr>
+      <w:r>
+        <w:t xml:space="preserve">Tested on 20 October 2026 on a temporary MySQL 8.0.43 server: the scripts run without errors, and the verification script passed 8 of 8 checks. The views match the processed CSV files (one value differs by 0.01 because MySQL rounds exact decimals while the Python pipeline rounded binary floats), and the database rejects invalid foreign keys, duplicate keys, and values that break the check constraints. Eight example queries reproduce dashboard results, for example Rwanda's 2020 GDP shortfall of −11.5 pp and the US unemployment rise of +4.4 pp.</w:t>
+      </w:r>
+    </w:p>
+    <w:p>
+      <w:pPr>
+        <w:pStyle w:val="Heading3"/>
+      </w:pPr>
+      <w:r>
+        <w:t xml:space="preserve">Why the dashboard does not connect to it</w:t>
+      </w:r>
+    </w:p>
+    <w:p>
+      <w:pPr>
+        <w:spacing w:after="120"/>
+      </w:pPr>
+      <w:r>
+        <w:t xml:space="preserve">The deployed app keeps reading the CSV files. A live connection would need a MySQL server reachable from Streamlit Community Cloud (a managed cloud service), credentials stored in Streamlit's Secrets setting and never in the repository, a read-only database user, and two extra Python packages. For about 1,850 fixed rows, the CSV files are faster and more reliable during the presentation.</w:t>
       </w:r>
     </w:p>
     <w:sectPr>

</xml_diff>